<commit_message>
modified:   "Repository of Research/Tech/A Probabilistic Machine Learning Framework for Outcome Prediction and Knock-out Simulation in UEFA Champions League Matches\n/.~lock.A Probabilistic Machine Learning Framework for Outcome Prediction and Knock-out Simulation in UEFA Champions League Matches\n.docx#" 	modified:   "Repository of Research/Tech/A Probabilistic Machine Learning Framework for Outcome Prediction and Knock-out Simulation in UEFA Champions League Matches\n/A Probabilistic Machine Learning Framework for Outcome Prediction and Knock-out Simulation in UEFA Champions League Matches\n.docx" 	modified:   "Repository of Research/Tech/A Probabilistic Machine Learning Framework for Outcome Prediction and Knock-out Simulation in UEFA Champions League Matches\n/A Probabilistic Machine Learning Framework for Outcome Prediction and Knock-out Simulation in UEFA Champions League Matches\n.pdf"
</commit_message>
<xml_diff>
--- a/Repository of Research/Tech/A Probabilistic Machine Learning Framework for Outcome Prediction and Knock-out Simulation in UEFA Champions League Matches
/A Probabilistic Machine Learning Framework for Outcome Prediction and Knock-out Simulation in UEFA Champions League Matches
.docx
+++ b/Repository of Research/Tech/A Probabilistic Machine Learning Framework for Outcome Prediction and Knock-out Simulation in UEFA Champions League Matches
/A Probabilistic Machine Learning Framework for Outcome Prediction and Knock-out Simulation in UEFA Champions League Matches
.docx
@@ -106,14 +106,19 @@
         <w:pStyle w:val="BodyText"/>
         <w:bidi w:val="0"/>
         <w:jc w:val="center"/>
+        <w:rPr/>
+      </w:pPr>
+      <w:r>
         <w:rPr>
           <w:rStyle w:val="Strong"/>
           <w:b w:val="false"/>
           <w:bCs w:val="false"/>
-        </w:rPr>
-      </w:pPr>
-      <w:r>
-        <w:rPr/>
+          <w:i/>
+          <w:iCs/>
+          <w:color w:val="2A6099"/>
+          <w:u w:val="single"/>
+        </w:rPr>
+        <w:t>https://github.com/aam-007/UEFA-CL-Prediction-Model</w:t>
       </w:r>
     </w:p>
     <w:p>

</xml_diff>